<commit_message>
fix(pcc): atividade organization paragraph matches three sections
Minimal word/document.xml surgery: six-section boilerplate copied from the projeto replaced with a three-section map. Re-extracted and verified: 106 paragraphs, 17 references, zero markers, paragraph formatting unchanged.
</commit_message>
<xml_diff>
--- a/dist/atividade-introducao-e-citacoes.docx
+++ b/dist/atividade-introducao-e-citacoes.docx
@@ -1,6 +1,6 @@
 
 <file path=word/document.xml><?xml version="1.0" encoding="utf-8"?>
-<w:document xmlns:wpc="http://schemas.microsoft.com/office/word/2010/wordprocessingCanvas" xmlns:mo="http://schemas.microsoft.com/office/mac/office/2008/main" xmlns:mc="http://schemas.openxmlformats.org/markup-compatibility/2006" xmlns:mv="urn:schemas-microsoft-com:mac:vml" xmlns:o="urn:schemas-microsoft-com:office:office" xmlns:r="http://schemas.openxmlformats.org/officeDocument/2006/relationships" xmlns:m="http://schemas.openxmlformats.org/officeDocument/2006/math" xmlns:v="urn:schemas-microsoft-com:vml" xmlns:wp14="http://schemas.microsoft.com/office/word/2010/wordprocessingDrawing" xmlns:wp="http://schemas.openxmlformats.org/drawingml/2006/wordprocessingDrawing" xmlns:w10="urn:schemas-microsoft-com:office:word" xmlns:w="http://schemas.openxmlformats.org/wordprocessingml/2006/main" xmlns:w14="http://schemas.microsoft.com/office/word/2010/wordml" xmlns:wpg="http://schemas.microsoft.com/office/word/2010/wordprocessingGroup" xmlns:wpi="http://schemas.microsoft.com/office/word/2010/wordprocessingInk" xmlns:wne="http://schemas.microsoft.com/office/word/2006/wordml" xmlns:wps="http://schemas.microsoft.com/office/word/2010/wordprocessingShape" mc:Ignorable="w14 wp14">
+<w:document xmlns:ns1="http://schemas.openxmlformats.org/markup-compatibility/2006" xmlns:ns2="http://schemas.openxmlformats.org/officeDocument/2006/relationships" xmlns:w="http://schemas.openxmlformats.org/wordprocessingml/2006/main" ns1:Ignorable="w14 wp14">
   <w:body>
     <w:p>
       <w:pPr>
@@ -1150,7 +1150,7 @@
           <w:i w:val="0"/>
           <w:sz w:val="24"/>
         </w:rPr>
-        <w:t>Este trabalho segue as normas do curso (IFMT, 2022) e as da ABNT (2023, 2025a, 2025b), e está organizado em seis seções. Esta introdução apresenta a justificativa, o tema, o problema, os objetivos, a metodologia e as hipóteses. A seção 2 posiciona o trabalho na literatura e delimita as pendências que ele se propõe a resolver. A seção 3 descreve o material e o método: classificação da pesquisa, camadas de medição, braços, suíte de tarefas, limites, tratamento estatístico, resultados preliminares do instrumento e limitações. A seção 4 apresenta o orçamento, a seção 5 o cronograma, e a seção 6 reúne as referências.</w:t>
+        <w:t xml:space="preserve">Este trabalho segue as normas do curso (IFMT, 2022) e as da ABNT (2023, 2025a, 2025b), e está organizado em três seções. Esta introdução apresenta a justificativa, o tema, o problema, os objetivos, a metodologia e as hipóteses. A seção 2 posiciona o trabalho na literatura e delimita as pendências que ele se propõe a resolver, e a seção 3 reúne as referências.</w:t>
       </w:r>
     </w:p>
     <w:p>
@@ -2632,7 +2632,7 @@
       </w:r>
     </w:p>
     <w:sectPr>
-      <w:headerReference w:type="default" r:id="rId9"/>
+      <w:headerReference w:type="default" ns2:id="rId9"/>
       <w:pgSz w:w="11906" w:h="16838"/>
       <w:pgMar w:top="1701" w:right="1134" w:bottom="1134" w:left="1701" w:header="720" w:footer="720" w:gutter="0"/>
       <w:cols w:space="720"/>

</xml_diff>